<commit_message>
reports: FR v2 + CTO copy updated with verified curriculum (M1-M6; M4=Crypto Tracing & Financial Attribution; evidence spine verbatim); Email A re-grounded on M4-M6 fit
</commit_message>
<xml_diff>
--- a/reports/FIELD-REPORT-UPNM-DARKWEB-20261012-14-CTO-COPY.docx
+++ b/reports/FIELD-REPORT-UPNM-DARKWEB-20261012-14-CTO-COPY.docx
@@ -68,7 +68,7 @@
         <w:t>reports/FIELD-REPORT-UPNM-DARKWEB-20261012-14.md</w:t>
       </w:r>
       <w:r>
-        <w:t xml:space="preserve"> (repo 83da7f3); sign-in extraction </w:t>
+        <w:t xml:space="preserve"> v2; sign-in extraction </w:t>
       </w:r>
       <w:r>
         <w:rPr>
@@ -78,7 +78,7 @@
         <w:t>roster/UPNM-DARKWEB-KEHADIRAN-20261014.md</w:t>
       </w:r>
       <w:r>
-        <w:t xml:space="preserve"> (65eb5f5)</w:t>
+        <w:t xml:space="preserve"> (65eb5f5); curriculum verified from course slide (OCR, 2 passes agree)</w:t>
       </w:r>
     </w:p>
     <w:p>
@@ -100,7 +100,16 @@
         <w:t>five RMAF personnel — four from RISUD (finance-corps investigation arm), one from AWC</w:t>
       </w:r>
       <w:r>
-        <w:t>. Military *financial* investigators getting dark-web training is a capacity-building signal directly adjacent to ChainSentry's ICP fringe. UPNM is simultaneously venue, host, and trainee pipeline — an academy/training-channel target. No asks on engineering beyond what the existing alpha window already commits; flagged so the week-1 load is visible.</w:t>
+        <w:t xml:space="preserve">. The curriculum makes this stronger than an attendance signal: six modules over three days with </w:t>
+      </w:r>
+      <w:r>
+        <w:rPr>
+          <w:b/>
+        </w:rPr>
+        <w:t>Day-2 afternoon = "Cryptocurrency Tracing &amp; Financial Attribution"</w:t>
+      </w:r>
+      <w:r>
+        <w:t>, and the course spine is *"legal safeguards, OPSEC and evidence preservation run through every module"* — ChainSentry's exact capability walk and evidentiary posture, taught by a buyer. UPNM is simultaneously venue, host, and trainee pipeline — an academy/training-channel target with a curriculum/tooling seam at Modules 4–6. No asks on engineering beyond what the existing alpha window already commits; flagged so the week-1 load is visible.</w:t>
       </w:r>
     </w:p>
     <w:p>
@@ -390,7 +399,172 @@
     </w:tbl>
     <w:p>
       <w:r>
-        <w:t>⚠ = handwritten in source photo, unresolved across OCR passes; variant ledger in the roster file. Verified for Day 3 only; Day 1–2 sheets not in evidence. [TBC-OWNER: organizer/facilitator/curriculum detail — Hadri to fill.]</w:t>
+        <w:t>⚠ = handwritten in source photo, unresolved across OCR passes; variant ledger in the roster file. Verified for Day 3 only; Day 1–2 sheets not in evidence.</w:t>
+      </w:r>
+    </w:p>
+    <w:p>
+      <w:pPr>
+        <w:pStyle w:val="Heading1"/>
+      </w:pPr>
+      <w:r>
+        <w:t>Curriculum (verified from course slide, "Three Days and Six Modules")</w:t>
+      </w:r>
+    </w:p>
+    <w:tbl>
+      <w:tblPr>
+        <w:tblStyle w:val="LightGrid-Accent1"/>
+        <w:tblW w:type="auto" w:w="0"/>
+        <w:tblLook w:firstColumn="1" w:firstRow="1" w:lastColumn="0" w:lastRow="0" w:noHBand="0" w:noVBand="1" w:val="04A0"/>
+      </w:tblPr>
+      <w:tblGrid>
+        <w:gridCol w:w="2880"/>
+        <w:gridCol w:w="2880"/>
+        <w:gridCol w:w="2880"/>
+      </w:tblGrid>
+      <w:tr>
+        <w:tc>
+          <w:tcPr>
+            <w:tcW w:type="dxa" w:w="2880"/>
+          </w:tcPr>
+          <w:p>
+            <w:r>
+              <w:rPr>
+                <w:b/>
+              </w:rPr>
+              <w:t>Day</w:t>
+            </w:r>
+          </w:p>
+        </w:tc>
+        <w:tc>
+          <w:tcPr>
+            <w:tcW w:type="dxa" w:w="2880"/>
+          </w:tcPr>
+          <w:p>
+            <w:r>
+              <w:rPr>
+                <w:b/>
+              </w:rPr>
+              <w:t>Morning</w:t>
+            </w:r>
+          </w:p>
+        </w:tc>
+        <w:tc>
+          <w:tcPr>
+            <w:tcW w:type="dxa" w:w="2880"/>
+          </w:tcPr>
+          <w:p>
+            <w:r>
+              <w:rPr>
+                <w:b/>
+              </w:rPr>
+              <w:t>Afternoon</w:t>
+            </w:r>
+          </w:p>
+        </w:tc>
+      </w:tr>
+      <w:tr>
+        <w:tc>
+          <w:tcPr>
+            <w:tcW w:type="dxa" w:w="2880"/>
+          </w:tcPr>
+          <w:p>
+            <w:r>
+              <w:t>Day 1 — 12 Oct</w:t>
+            </w:r>
+          </w:p>
+        </w:tc>
+        <w:tc>
+          <w:tcPr>
+            <w:tcW w:type="dxa" w:w="2880"/>
+          </w:tcPr>
+          <w:p>
+            <w:r>
+              <w:t>M1 Dark Web Infrastructure &amp; Anonymity</w:t>
+            </w:r>
+          </w:p>
+        </w:tc>
+        <w:tc>
+          <w:tcPr>
+            <w:tcW w:type="dxa" w:w="2880"/>
+          </w:tcPr>
+          <w:p>
+            <w:r>
+              <w:t>M2 Criminal Ecosystems &amp; Illicit Economies</w:t>
+            </w:r>
+          </w:p>
+        </w:tc>
+      </w:tr>
+      <w:tr>
+        <w:tc>
+          <w:tcPr>
+            <w:tcW w:type="dxa" w:w="2880"/>
+          </w:tcPr>
+          <w:p>
+            <w:r>
+              <w:t>Day 2 — 13 Oct</w:t>
+            </w:r>
+          </w:p>
+        </w:tc>
+        <w:tc>
+          <w:tcPr>
+            <w:tcW w:type="dxa" w:w="2880"/>
+          </w:tcPr>
+          <w:p>
+            <w:r>
+              <w:t>M3 Intelligence Collection &amp; Data Extraction</w:t>
+            </w:r>
+          </w:p>
+        </w:tc>
+        <w:tc>
+          <w:tcPr>
+            <w:tcW w:type="dxa" w:w="2880"/>
+          </w:tcPr>
+          <w:p>
+            <w:r>
+              <w:rPr>
+                <w:b/>
+              </w:rPr>
+              <w:t>M4 Cryptocurrency Tracing &amp; Financial Attribution</w:t>
+            </w:r>
+          </w:p>
+        </w:tc>
+      </w:tr>
+      <w:tr>
+        <w:tc>
+          <w:tcPr>
+            <w:tcW w:type="dxa" w:w="2880"/>
+          </w:tcPr>
+          <w:p>
+            <w:r>
+              <w:t>Day 3 — 14 Oct</w:t>
+            </w:r>
+          </w:p>
+        </w:tc>
+        <w:tc>
+          <w:tcPr>
+            <w:tcW w:type="dxa" w:w="2880"/>
+          </w:tcPr>
+          <w:p>
+            <w:r>
+              <w:t>M5 Investigative Tradecraft &amp; OPSEC</w:t>
+            </w:r>
+          </w:p>
+        </w:tc>
+        <w:tc>
+          <w:tcPr>
+            <w:tcW w:type="dxa" w:w="2880"/>
+          </w:tcPr>
+          <w:p>
+            <w:r>
+              <w:t>M6 Intelligence Analysis &amp; Reporting</w:t>
+            </w:r>
+          </w:p>
+        </w:tc>
+      </w:tr>
+    </w:tbl>
+    <w:p>
+      <w:r>
+        <w:t>Course spine, verbatim: *"Legal safeguards, OPSEC and evidence preservation run through every module."* Instructors not identified in materials seen. [TBC-OWNER: facilitator identities.]</w:t>
       </w:r>
     </w:p>
     <w:p>

</xml_diff>